<commit_message>
Deployed dda881e with MkDocs version: 1.6.1
</commit_message>
<xml_diff>
--- a/assets/files/shiva-naik-cv.docx
+++ b/assets/files/shiva-naik-cv.docx
@@ -749,18 +749,8 @@
                 <w:color w:val="000000"/>
                 <w:sz w:val="18"/>
               </w:rPr>
-              <w:t>github.com/</w:t>
-            </w:r>
-            <w:proofErr w:type="spellStart"/>
-            <w:r>
-              <w:rPr>
-                <w:rFonts w:ascii="Segoe UI" w:eastAsia="Segoe UI" w:hAnsi="Segoe UI" w:cs="Segoe UI"/>
-                <w:color w:val="000000"/>
-                <w:sz w:val="18"/>
-              </w:rPr>
-              <w:t>shivaops</w:t>
-            </w:r>
-            <w:proofErr w:type="spellEnd"/>
+              <w:t>github.com/shivaops</w:t>
+            </w:r>
           </w:p>
           <w:p>
             <w:pPr>
@@ -801,15 +791,7 @@
                 <w:color w:val="000000"/>
                 <w:sz w:val="18"/>
               </w:rPr>
-              <w:t>www.linkedin.com/in/</w:t>
-            </w:r>
-            <w:r>
-              <w:rPr>
-                <w:rFonts w:ascii="Segoe UI" w:eastAsia="Segoe UI" w:hAnsi="Segoe UI" w:cs="Segoe UI"/>
-                <w:color w:val="000000"/>
-                <w:sz w:val="18"/>
-              </w:rPr>
-              <w:t>ShivaOps</w:t>
+              <w:t>www.linkedin.com/in/ShivaOps</w:t>
             </w:r>
             <w:r>
               <w:rPr>
@@ -857,26 +839,8 @@
                 <w:color w:val="000000"/>
                 <w:sz w:val="18"/>
               </w:rPr>
-              <w:t>shivaops.github.io/</w:t>
-            </w:r>
-            <w:proofErr w:type="spellStart"/>
-            <w:r>
-              <w:rPr>
-                <w:rFonts w:ascii="Segoe UI" w:eastAsia="Segoe UI" w:hAnsi="Segoe UI" w:cs="Segoe UI"/>
-                <w:color w:val="000000"/>
-                <w:sz w:val="18"/>
-              </w:rPr>
-              <w:t>shivaop</w:t>
-            </w:r>
-            <w:r>
-              <w:rPr>
-                <w:rFonts w:ascii="Segoe UI" w:eastAsia="Segoe UI" w:hAnsi="Segoe UI" w:cs="Segoe UI"/>
-                <w:color w:val="000000"/>
-                <w:sz w:val="18"/>
-              </w:rPr>
-              <w:t>s</w:t>
-            </w:r>
-            <w:proofErr w:type="spellEnd"/>
+              <w:t>shivaops.github.io</w:t>
+            </w:r>
             <w:r>
               <w:rPr>
                 <w:rFonts w:ascii="Segoe UI" w:eastAsia="Segoe UI" w:hAnsi="Segoe UI" w:cs="Segoe UI"/>
@@ -893,17 +857,23 @@
                 <w:color w:val="000000"/>
                 <w:sz w:val="18"/>
               </w:rPr>
-              <w:t>YouTube:</w:t>
-            </w:r>
-            <w:r>
-              <w:rPr>
-                <w:rFonts w:ascii="Segoe UI" w:eastAsia="Segoe UI" w:hAnsi="Segoe UI" w:cs="Segoe UI"/>
-                <w:b/>
-                <w:bCs/>
-                <w:color w:val="000000"/>
-                <w:sz w:val="18"/>
-              </w:rPr>
-              <w:t xml:space="preserve"> []</w:t>
+              <w:t>YouTube</w:t>
+            </w:r>
+            <w:r>
+              <w:rPr>
+                <w:rFonts w:ascii="Segoe UI" w:eastAsia="Segoe UI" w:hAnsi="Segoe UI" w:cs="Segoe UI"/>
+                <w:color w:val="000000"/>
+                <w:sz w:val="18"/>
+              </w:rPr>
+              <w:t xml:space="preserve">: </w:t>
+            </w:r>
+            <w:r>
+              <w:rPr>
+                <w:rFonts w:ascii="Segoe UI" w:eastAsia="Segoe UI" w:hAnsi="Segoe UI" w:cs="Segoe UI"/>
+                <w:color w:val="000000"/>
+                <w:sz w:val="18"/>
+              </w:rPr>
+              <w:t>www.youtube.com/@shivaops-h5j</w:t>
             </w:r>
           </w:p>
           <w:p>
@@ -1326,19 +1296,8 @@
                 <w:color w:val="000000"/>
                 <w:sz w:val="18"/>
               </w:rPr>
-              <w:t xml:space="preserve">Python, </w:t>
-            </w:r>
-            <w:proofErr w:type="spellStart"/>
-            <w:r>
-              <w:rPr>
-                <w:rFonts w:ascii="Segoe UI" w:eastAsia="Segoe UI" w:hAnsi="Segoe UI" w:cs="Segoe UI"/>
-                <w:bCs/>
-                <w:color w:val="000000"/>
-                <w:sz w:val="18"/>
-              </w:rPr>
-              <w:t>Langraph</w:t>
-            </w:r>
-            <w:proofErr w:type="spellEnd"/>
+              <w:t>Python, Langraph</w:t>
+            </w:r>
             <w:r>
               <w:rPr>
                 <w:rFonts w:ascii="Segoe UI" w:eastAsia="Segoe UI" w:hAnsi="Segoe UI" w:cs="Segoe UI"/>
@@ -2124,7 +2083,6 @@
                 <w:szCs w:val="20"/>
               </w:rPr>
             </w:pPr>
-            <w:proofErr w:type="gramStart"/>
             <w:r>
               <w:rPr>
                 <w:rFonts w:ascii="Arial Nova" w:hAnsi="Arial Nova"/>
@@ -2134,7 +2092,6 @@
               </w:rPr>
               <w:t>Personal</w:t>
             </w:r>
-            <w:proofErr w:type="gramEnd"/>
           </w:p>
           <w:p>
             <w:r>
@@ -4554,29 +4511,7 @@
                 <w:sz w:val="18"/>
                 <w:lang w:val="en-GB"/>
               </w:rPr>
-              <w:t xml:space="preserve">Supported production applications, </w:t>
-            </w:r>
-            <w:proofErr w:type="spellStart"/>
-            <w:r>
-              <w:rPr>
-                <w:rFonts w:ascii="Segoe UI" w:eastAsia="Segoe UI" w:hAnsi="Segoe UI" w:cs="Segoe UI"/>
-                <w:bCs/>
-                <w:color w:val="000000"/>
-                <w:sz w:val="18"/>
-                <w:lang w:val="en-GB"/>
-              </w:rPr>
-              <w:t>analyzed</w:t>
-            </w:r>
-            <w:proofErr w:type="spellEnd"/>
-            <w:r>
-              <w:rPr>
-                <w:rFonts w:ascii="Segoe UI" w:eastAsia="Segoe UI" w:hAnsi="Segoe UI" w:cs="Segoe UI"/>
-                <w:bCs/>
-                <w:color w:val="000000"/>
-                <w:sz w:val="18"/>
-                <w:lang w:val="en-GB"/>
-              </w:rPr>
-              <w:t xml:space="preserve"> issues, and implemented timely fixes and enhancements. </w:t>
+              <w:t xml:space="preserve">Supported production applications, analyzed issues, and implemented timely fixes and enhancements. </w:t>
             </w:r>
           </w:p>
           <w:p>
@@ -7966,6 +7901,7 @@
   <w:style w:type="character" w:default="1" w:styleId="DefaultParagraphFont">
     <w:name w:val="Default Paragraph Font"/>
     <w:uiPriority w:val="1"/>
+    <w:semiHidden/>
     <w:unhideWhenUsed/>
   </w:style>
   <w:style w:type="table" w:default="1" w:styleId="TableNormal">
@@ -8562,8 +8498,10 @@
     <w:rsidRoot w:val="00AD01EA"/>
     <w:rsid w:val="00047DB2"/>
     <w:rsid w:val="001918A6"/>
+    <w:rsid w:val="00202108"/>
     <w:rsid w:val="002A3815"/>
     <w:rsid w:val="002C064C"/>
+    <w:rsid w:val="004311F9"/>
     <w:rsid w:val="005B6603"/>
     <w:rsid w:val="00890EDF"/>
     <w:rsid w:val="008B0605"/>
@@ -9387,30 +9325,15 @@
 </file>
 
 <file path=customXml/item1.xml><?xml version="1.0" encoding="utf-8"?>
-<p:properties xmlns:p="http://schemas.microsoft.com/office/2006/metadata/properties" xmlns:xsi="http://www.w3.org/2001/XMLSchema-instance" xmlns:pc="http://schemas.microsoft.com/office/infopath/2007/PartnerControls">
-  <documentManagement>
-    <_ip_UnifiedCompliancePolicyUIAction xmlns="http://schemas.microsoft.com/sharepoint/v3" xsi:nil="true"/>
-    <Image xmlns="71af3243-3dd4-4a8d-8c0d-dd76da1f02a5">
-      <Url xsi:nil="true"/>
-      <Description xsi:nil="true"/>
-    </Image>
-    <Status xmlns="71af3243-3dd4-4a8d-8c0d-dd76da1f02a5">Not started</Status>
-    <Background xmlns="71af3243-3dd4-4a8d-8c0d-dd76da1f02a5">false</Background>
-    <_ip_UnifiedCompliancePolicyProperties xmlns="http://schemas.microsoft.com/sharepoint/v3" xsi:nil="true"/>
-    <ImageTagsTaxHTField xmlns="71af3243-3dd4-4a8d-8c0d-dd76da1f02a5">
-      <Terms xmlns="http://schemas.microsoft.com/office/infopath/2007/PartnerControls"/>
-    </ImageTagsTaxHTField>
-    <TaxCatchAll xmlns="230e9df3-be65-4c73-a93b-d1236ebd677e" xsi:nil="true"/>
-    <MediaServiceKeyPoints xmlns="71af3243-3dd4-4a8d-8c0d-dd76da1f02a5" xsi:nil="true"/>
-  </documentManagement>
-</p:properties>
+<?mso-contentType ?>
+<FormTemplates xmlns="http://schemas.microsoft.com/sharepoint/v3/contenttype/forms">
+  <Display>DocumentLibraryForm</Display>
+  <Edit>DocumentLibraryForm</Edit>
+  <New>DocumentLibraryForm</New>
+</FormTemplates>
 </file>
 
 <file path=customXml/item2.xml><?xml version="1.0" encoding="utf-8"?>
-<b:Sources xmlns:b="http://schemas.openxmlformats.org/officeDocument/2006/bibliography" xmlns="http://schemas.openxmlformats.org/officeDocument/2006/bibliography" SelectedStyle="\APASixthEditionOfficeOnline.xsl" StyleName="APA" Version="6"/>
-</file>
-
-<file path=customXml/item3.xml><?xml version="1.0" encoding="utf-8"?>
 <ct:contentTypeSchema xmlns:ct="http://schemas.microsoft.com/office/2006/metadata/contentType" xmlns:ma="http://schemas.microsoft.com/office/2006/metadata/properties/metaAttributes" ct:_="" ma:_="" ma:contentTypeName="Document" ma:contentTypeID="0x01010079F111ED35F8CC479449609E8A0923A6" ma:contentTypeVersion="28" ma:contentTypeDescription="Create a new document." ma:contentTypeScope="" ma:versionID="60f5a4f2d2b0abadcf532d48ebf9cb71">
   <xsd:schema xmlns:xsd="http://www.w3.org/2001/XMLSchema" xmlns:xs="http://www.w3.org/2001/XMLSchema" xmlns:p="http://schemas.microsoft.com/office/2006/metadata/properties" xmlns:ns1="http://schemas.microsoft.com/sharepoint/v3" xmlns:ns2="71af3243-3dd4-4a8d-8c0d-dd76da1f02a5" xmlns:ns3="16c05727-aa75-4e4a-9b5f-8a80a1165891" xmlns:ns4="230e9df3-be65-4c73-a93b-d1236ebd677e" targetNamespace="http://schemas.microsoft.com/office/2006/metadata/properties" ma:root="true" ma:fieldsID="7dd78129e6a1811f84807ad11c651531" ns1:_="" ns2:_="" ns3:_="" ns4:_="">
     <xsd:import namespace="http://schemas.microsoft.com/sharepoint/v3"/>
@@ -9722,36 +9645,39 @@
 </ct:contentTypeSchema>
 </file>
 
+<file path=customXml/item3.xml><?xml version="1.0" encoding="utf-8"?>
+<b:Sources xmlns:b="http://schemas.openxmlformats.org/officeDocument/2006/bibliography" xmlns="http://schemas.openxmlformats.org/officeDocument/2006/bibliography" SelectedStyle="\APASixthEditionOfficeOnline.xsl" StyleName="APA" Version="6"/>
+</file>
+
 <file path=customXml/item4.xml><?xml version="1.0" encoding="utf-8"?>
-<?mso-contentType ?>
-<FormTemplates xmlns="http://schemas.microsoft.com/sharepoint/v3/contenttype/forms">
-  <Display>DocumentLibraryForm</Display>
-  <Edit>DocumentLibraryForm</Edit>
-  <New>DocumentLibraryForm</New>
-</FormTemplates>
+<p:properties xmlns:p="http://schemas.microsoft.com/office/2006/metadata/properties" xmlns:xsi="http://www.w3.org/2001/XMLSchema-instance" xmlns:pc="http://schemas.microsoft.com/office/infopath/2007/PartnerControls">
+  <documentManagement>
+    <_ip_UnifiedCompliancePolicyUIAction xmlns="http://schemas.microsoft.com/sharepoint/v3" xsi:nil="true"/>
+    <Image xmlns="71af3243-3dd4-4a8d-8c0d-dd76da1f02a5">
+      <Url xsi:nil="true"/>
+      <Description xsi:nil="true"/>
+    </Image>
+    <Status xmlns="71af3243-3dd4-4a8d-8c0d-dd76da1f02a5">Not started</Status>
+    <Background xmlns="71af3243-3dd4-4a8d-8c0d-dd76da1f02a5">false</Background>
+    <_ip_UnifiedCompliancePolicyProperties xmlns="http://schemas.microsoft.com/sharepoint/v3" xsi:nil="true"/>
+    <ImageTagsTaxHTField xmlns="71af3243-3dd4-4a8d-8c0d-dd76da1f02a5">
+      <Terms xmlns="http://schemas.microsoft.com/office/infopath/2007/PartnerControls"/>
+    </ImageTagsTaxHTField>
+    <TaxCatchAll xmlns="230e9df3-be65-4c73-a93b-d1236ebd677e" xsi:nil="true"/>
+    <MediaServiceKeyPoints xmlns="71af3243-3dd4-4a8d-8c0d-dd76da1f02a5" xsi:nil="true"/>
+  </documentManagement>
+</p:properties>
 </file>
 
 <file path=customXml/itemProps1.xml><?xml version="1.0" encoding="utf-8"?>
-<ds:datastoreItem xmlns:ds="http://schemas.openxmlformats.org/officeDocument/2006/customXml" ds:itemID="{4720275F-CC8A-4230-8267-B84213CEBBD9}">
+<ds:datastoreItem xmlns:ds="http://schemas.openxmlformats.org/officeDocument/2006/customXml" ds:itemID="{2D5CED70-FA13-46C4-A102-29F5645502CE}">
   <ds:schemaRefs>
-    <ds:schemaRef ds:uri="http://schemas.microsoft.com/office/2006/metadata/properties"/>
-    <ds:schemaRef ds:uri="http://schemas.microsoft.com/office/infopath/2007/PartnerControls"/>
-    <ds:schemaRef ds:uri="http://schemas.microsoft.com/sharepoint/v3"/>
-    <ds:schemaRef ds:uri="71af3243-3dd4-4a8d-8c0d-dd76da1f02a5"/>
-    <ds:schemaRef ds:uri="230e9df3-be65-4c73-a93b-d1236ebd677e"/>
+    <ds:schemaRef ds:uri="http://schemas.microsoft.com/sharepoint/v3/contenttype/forms"/>
   </ds:schemaRefs>
 </ds:datastoreItem>
 </file>
 
 <file path=customXml/itemProps2.xml><?xml version="1.0" encoding="utf-8"?>
-<ds:datastoreItem xmlns:ds="http://schemas.openxmlformats.org/officeDocument/2006/customXml" ds:itemID="{81F788BB-310B-43D7-B9F5-95A6C7D991AA}">
-  <ds:schemaRefs>
-    <ds:schemaRef ds:uri="http://schemas.openxmlformats.org/officeDocument/2006/bibliography"/>
-  </ds:schemaRefs>
-</ds:datastoreItem>
-</file>
-
-<file path=customXml/itemProps3.xml><?xml version="1.0" encoding="utf-8"?>
 <ds:datastoreItem xmlns:ds="http://schemas.openxmlformats.org/officeDocument/2006/customXml" ds:itemID="{DC41AEFC-F52C-404E-B283-E9E6F4470B13}">
   <ds:schemaRefs>
     <ds:schemaRef ds:uri="http://schemas.microsoft.com/office/2006/metadata/contentType"/>
@@ -9772,10 +9698,22 @@
 </ds:datastoreItem>
 </file>
 
+<file path=customXml/itemProps3.xml><?xml version="1.0" encoding="utf-8"?>
+<ds:datastoreItem xmlns:ds="http://schemas.openxmlformats.org/officeDocument/2006/customXml" ds:itemID="{81F788BB-310B-43D7-B9F5-95A6C7D991AA}">
+  <ds:schemaRefs>
+    <ds:schemaRef ds:uri="http://schemas.openxmlformats.org/officeDocument/2006/bibliography"/>
+  </ds:schemaRefs>
+</ds:datastoreItem>
+</file>
+
 <file path=customXml/itemProps4.xml><?xml version="1.0" encoding="utf-8"?>
-<ds:datastoreItem xmlns:ds="http://schemas.openxmlformats.org/officeDocument/2006/customXml" ds:itemID="{2D5CED70-FA13-46C4-A102-29F5645502CE}">
+<ds:datastoreItem xmlns:ds="http://schemas.openxmlformats.org/officeDocument/2006/customXml" ds:itemID="{4720275F-CC8A-4230-8267-B84213CEBBD9}">
   <ds:schemaRefs>
-    <ds:schemaRef ds:uri="http://schemas.microsoft.com/sharepoint/v3/contenttype/forms"/>
+    <ds:schemaRef ds:uri="http://schemas.microsoft.com/office/2006/metadata/properties"/>
+    <ds:schemaRef ds:uri="http://schemas.microsoft.com/office/infopath/2007/PartnerControls"/>
+    <ds:schemaRef ds:uri="http://schemas.microsoft.com/sharepoint/v3"/>
+    <ds:schemaRef ds:uri="71af3243-3dd4-4a8d-8c0d-dd76da1f02a5"/>
+    <ds:schemaRef ds:uri="230e9df3-be65-4c73-a93b-d1236ebd677e"/>
   </ds:schemaRefs>
 </ds:datastoreItem>
 </file>

</xml_diff>

<commit_message>
Deployed f1ee6db with MkDocs version: 1.6.1
</commit_message>
<xml_diff>
--- a/assets/files/shiva-naik-cv.docx
+++ b/assets/files/shiva-naik-cv.docx
@@ -749,7 +749,39 @@
                 <w:color w:val="000000"/>
                 <w:sz w:val="18"/>
               </w:rPr>
-              <w:t>github.com/shivaops</w:t>
+              <w:t>github.com/</w:t>
+            </w:r>
+            <w:r>
+              <w:rPr>
+                <w:rFonts w:ascii="Segoe UI" w:eastAsia="Segoe UI" w:hAnsi="Segoe UI" w:cs="Segoe UI"/>
+                <w:color w:val="000000"/>
+                <w:sz w:val="18"/>
+              </w:rPr>
+              <w:t>S</w:t>
+            </w:r>
+            <w:r>
+              <w:rPr>
+                <w:rFonts w:ascii="Segoe UI" w:eastAsia="Segoe UI" w:hAnsi="Segoe UI" w:cs="Segoe UI"/>
+                <w:color w:val="000000"/>
+                <w:sz w:val="18"/>
+              </w:rPr>
+              <w:t>hiva</w:t>
+            </w:r>
+            <w:r>
+              <w:rPr>
+                <w:rFonts w:ascii="Segoe UI" w:eastAsia="Segoe UI" w:hAnsi="Segoe UI" w:cs="Segoe UI"/>
+                <w:color w:val="000000"/>
+                <w:sz w:val="18"/>
+              </w:rPr>
+              <w:t>O</w:t>
+            </w:r>
+            <w:r>
+              <w:rPr>
+                <w:rFonts w:ascii="Segoe UI" w:eastAsia="Segoe UI" w:hAnsi="Segoe UI" w:cs="Segoe UI"/>
+                <w:color w:val="000000"/>
+                <w:sz w:val="18"/>
+              </w:rPr>
+              <w:t>ps</w:t>
             </w:r>
           </w:p>
           <w:p>
@@ -839,7 +871,31 @@
                 <w:color w:val="000000"/>
                 <w:sz w:val="18"/>
               </w:rPr>
-              <w:t>shivaops.github.io</w:t>
+              <w:t>S</w:t>
+            </w:r>
+            <w:r>
+              <w:rPr>
+                <w:rFonts w:ascii="Segoe UI" w:eastAsia="Segoe UI" w:hAnsi="Segoe UI" w:cs="Segoe UI"/>
+                <w:color w:val="000000"/>
+                <w:sz w:val="18"/>
+              </w:rPr>
+              <w:t>hiva</w:t>
+            </w:r>
+            <w:r>
+              <w:rPr>
+                <w:rFonts w:ascii="Segoe UI" w:eastAsia="Segoe UI" w:hAnsi="Segoe UI" w:cs="Segoe UI"/>
+                <w:color w:val="000000"/>
+                <w:sz w:val="18"/>
+              </w:rPr>
+              <w:t>O</w:t>
+            </w:r>
+            <w:r>
+              <w:rPr>
+                <w:rFonts w:ascii="Segoe UI" w:eastAsia="Segoe UI" w:hAnsi="Segoe UI" w:cs="Segoe UI"/>
+                <w:color w:val="000000"/>
+                <w:sz w:val="18"/>
+              </w:rPr>
+              <w:t>ps.github.io</w:t>
             </w:r>
             <w:r>
               <w:rPr>
@@ -873,7 +929,47 @@
                 <w:color w:val="000000"/>
                 <w:sz w:val="18"/>
               </w:rPr>
-              <w:t>www.youtube.com/@shivaops-h5j</w:t>
+              <w:t>www.youtube.com/@</w:t>
+            </w:r>
+            <w:r>
+              <w:rPr>
+                <w:rFonts w:ascii="Segoe UI" w:eastAsia="Segoe UI" w:hAnsi="Segoe UI" w:cs="Segoe UI"/>
+                <w:color w:val="000000"/>
+                <w:sz w:val="18"/>
+              </w:rPr>
+              <w:t>S</w:t>
+            </w:r>
+            <w:r>
+              <w:rPr>
+                <w:rFonts w:ascii="Segoe UI" w:eastAsia="Segoe UI" w:hAnsi="Segoe UI" w:cs="Segoe UI"/>
+                <w:color w:val="000000"/>
+                <w:sz w:val="18"/>
+              </w:rPr>
+              <w:t>hiva</w:t>
+            </w:r>
+            <w:r>
+              <w:rPr>
+                <w:rFonts w:ascii="Segoe UI" w:eastAsia="Segoe UI" w:hAnsi="Segoe UI" w:cs="Segoe UI"/>
+                <w:color w:val="000000"/>
+                <w:sz w:val="18"/>
+              </w:rPr>
+              <w:t>O</w:t>
+            </w:r>
+            <w:r>
+              <w:rPr>
+                <w:rFonts w:ascii="Segoe UI" w:eastAsia="Segoe UI" w:hAnsi="Segoe UI" w:cs="Segoe UI"/>
+                <w:color w:val="000000"/>
+                <w:sz w:val="18"/>
+              </w:rPr>
+              <w:t>ps-</w:t>
+            </w:r>
+            <w:r>
+              <w:rPr>
+                <w:rFonts w:ascii="Segoe UI" w:eastAsia="Segoe UI" w:hAnsi="Segoe UI" w:cs="Segoe UI"/>
+                <w:color w:val="000000"/>
+                <w:sz w:val="18"/>
+              </w:rPr>
+              <w:t>AI</w:t>
             </w:r>
           </w:p>
           <w:p>
@@ -8497,6 +8593,7 @@
   <w:rsids>
     <w:rsidRoot w:val="00AD01EA"/>
     <w:rsid w:val="00047DB2"/>
+    <w:rsid w:val="00183E0F"/>
     <w:rsid w:val="001918A6"/>
     <w:rsid w:val="00202108"/>
     <w:rsid w:val="002A3815"/>
@@ -8510,6 +8607,7 @@
     <w:rsid w:val="00A03874"/>
     <w:rsid w:val="00AD01EA"/>
     <w:rsid w:val="00B03182"/>
+    <w:rsid w:val="00C017C2"/>
     <w:rsid w:val="00CC54EF"/>
     <w:rsid w:val="00F672FA"/>
   </w:rsids>
@@ -9325,12 +9423,7 @@
 </file>
 
 <file path=customXml/item1.xml><?xml version="1.0" encoding="utf-8"?>
-<?mso-contentType ?>
-<FormTemplates xmlns="http://schemas.microsoft.com/sharepoint/v3/contenttype/forms">
-  <Display>DocumentLibraryForm</Display>
-  <Edit>DocumentLibraryForm</Edit>
-  <New>DocumentLibraryForm</New>
-</FormTemplates>
+<b:Sources xmlns:b="http://schemas.openxmlformats.org/officeDocument/2006/bibliography" xmlns="http://schemas.openxmlformats.org/officeDocument/2006/bibliography" SelectedStyle="\APASixthEditionOfficeOnline.xsl" StyleName="APA" Version="6"/>
 </file>
 
 <file path=customXml/item2.xml><?xml version="1.0" encoding="utf-8"?>
@@ -9646,7 +9739,12 @@
 </file>
 
 <file path=customXml/item3.xml><?xml version="1.0" encoding="utf-8"?>
-<b:Sources xmlns:b="http://schemas.openxmlformats.org/officeDocument/2006/bibliography" xmlns="http://schemas.openxmlformats.org/officeDocument/2006/bibliography" SelectedStyle="\APASixthEditionOfficeOnline.xsl" StyleName="APA" Version="6"/>
+<?mso-contentType ?>
+<FormTemplates xmlns="http://schemas.microsoft.com/sharepoint/v3/contenttype/forms">
+  <Display>DocumentLibraryForm</Display>
+  <Edit>DocumentLibraryForm</Edit>
+  <New>DocumentLibraryForm</New>
+</FormTemplates>
 </file>
 
 <file path=customXml/item4.xml><?xml version="1.0" encoding="utf-8"?>
@@ -9670,9 +9768,9 @@
 </file>
 
 <file path=customXml/itemProps1.xml><?xml version="1.0" encoding="utf-8"?>
-<ds:datastoreItem xmlns:ds="http://schemas.openxmlformats.org/officeDocument/2006/customXml" ds:itemID="{2D5CED70-FA13-46C4-A102-29F5645502CE}">
+<ds:datastoreItem xmlns:ds="http://schemas.openxmlformats.org/officeDocument/2006/customXml" ds:itemID="{81F788BB-310B-43D7-B9F5-95A6C7D991AA}">
   <ds:schemaRefs>
-    <ds:schemaRef ds:uri="http://schemas.microsoft.com/sharepoint/v3/contenttype/forms"/>
+    <ds:schemaRef ds:uri="http://schemas.openxmlformats.org/officeDocument/2006/bibliography"/>
   </ds:schemaRefs>
 </ds:datastoreItem>
 </file>
@@ -9699,9 +9797,9 @@
 </file>
 
 <file path=customXml/itemProps3.xml><?xml version="1.0" encoding="utf-8"?>
-<ds:datastoreItem xmlns:ds="http://schemas.openxmlformats.org/officeDocument/2006/customXml" ds:itemID="{81F788BB-310B-43D7-B9F5-95A6C7D991AA}">
+<ds:datastoreItem xmlns:ds="http://schemas.openxmlformats.org/officeDocument/2006/customXml" ds:itemID="{2D5CED70-FA13-46C4-A102-29F5645502CE}">
   <ds:schemaRefs>
-    <ds:schemaRef ds:uri="http://schemas.openxmlformats.org/officeDocument/2006/bibliography"/>
+    <ds:schemaRef ds:uri="http://schemas.microsoft.com/sharepoint/v3/contenttype/forms"/>
   </ds:schemaRefs>
 </ds:datastoreItem>
 </file>

</xml_diff>